<commit_message>
Remove meeting ordinals from IAP minutes and attendance sheets
Co-Authored-By: Claude Opus 5.5 <noreply@anthropic.com>
Claude-Session: https://claude.ai/code/session_01ELaQ6vS1YNg97XUU7RUmR3
</commit_message>
<xml_diff>
--- a/All Annexure Citeria 10/10.1/Meeting-minutes-IAP/IAP_Meeting_Minutes_02_2023_14th_October_2023.docx
+++ b/All Annexure Citeria 10/10.1/Meeting-minutes-IAP/IAP_Meeting_Minutes_02_2023_14th_October_2023.docx
@@ -97,7 +97,7 @@
           <w:sz w:val="26"/>
           <w:u w:val="single"/>
         </w:rPr>
-        <w:t>Proceedings of the 2nd Meeting with the Industrial Advisory Panel</w:t>
+        <w:t>Proceedings of the Meeting with the Industrial Advisory Panel</w:t>
       </w:r>
     </w:p>
     <w:p>
@@ -317,7 +317,7 @@
               <w:rPr>
                 <w:sz w:val="20"/>
               </w:rPr>
-              <w:t>The minutes of the 1st meeting were confirmed. Progress on the decisions of the previous meeting was reviewed.</w:t>
+              <w:t>The minutes of the previous meeting were confirmed. Progress on the decisions of the previous meeting was reviewed.</w:t>
             </w:r>
           </w:p>
         </w:tc>

</xml_diff>